<commit_message>
Add the 25 Aug 2026 cloud-edge spot-check to the validation report
Direct check of the date mentioned in the supervisor's feedback:
Aqua pre-dawn showed the expected cold-edge pattern, Terra morning
showed no meaningful effect, and Aqua afternoon showed the opposite
direction - likely a sign of the separate partial-cloud-cover effect
rather than cloud-edge contamination, since which part of the lake is
visible on a partly-cloudy day is not random.
</commit_message>
<xml_diff>
--- a/docs/METHODS_AND_VALIDATION_REPORT.docx
+++ b/docs/METHODS_AND_VALIDATION_REPORT.docx
@@ -65,7 +65,7 @@
       <w:pPr>
         <w:spacing w:after="160"/>
       </w:pPr>
-      <w:hyperlink w:history="1" r:id="rIdtqm6jdtb22ah4bg9ujmhl">
+      <w:hyperlink w:history="1" r:id="rIdn578-7wloxox5qijc5ztl">
         <w:r>
           <w:rPr>
             <w:rStyle w:val="Hyperlink"/>
@@ -782,6 +782,14 @@
       </w:pPr>
       <w:r>
         <w:t xml:space="preserve">Pixels immediately bordering a cloud-masked gap were found to read measurably colder than pixels further from any gap (−0.8 to −3.1°C across four tested dates) — a pixel can be mostly clear water but partly cloud and still pass the cloud test, especially at a cloud edge’s thinning boundary, and cloud tops are far colder than the lake surface. This is a documented general limitation of MODIS LST, not specific to this processing. It has not been corrected: tightening the pixel filter to exclude edge-adjacent pixels would further shrink the already-thin nighttime coverage, a trade-off already rejected once for that reason.</w:t>
+      </w:r>
+    </w:p>
+    <w:p>
+      <w:pPr>
+        <w:spacing w:after="160"/>
+      </w:pPr>
+      <w:r>
+        <w:t xml:space="preserve">A direct spot-check of 25 August 2026 (requested during supervisor review) found a mixed picture, not a uniform cold-edge signal: Aqua pre-dawn showed the expected pattern (gap-adjacent pixels −1.44°C versus the rest of the lake, n=116 vs. n=29); Terra morning showed no meaningful effect (+0.19°C, but at only ~12% coverage); and Aqua afternoon showed the opposite direction (gap-adjacent pixels +1.83°C warmer, n=177 vs. n=120, at a more usable ~62% coverage). That reversed result on the afternoon pass does not fit the cloud-edge-contamination mechanism and is more likely a sign of the separate partial-cloud-cover effect described in Section 5.4 — which part of the lake happens to be cloud-free is not random, and on that date the clear patches may simply have been concentrated in a warmer part of the lake.</w:t>
       </w:r>
     </w:p>
     <w:p>

</xml_diff>

<commit_message>
Add a real legend for the anomaly map; drop "experimental" wording
The anomaly map previously reused the temperature legend's blank
placeholder state and explained its colour scale in text only. It now
has its own diverging legend bar (blue-white-red, fixed -6..+6 degC,
never cropped to the day's own range, since the centre - zero, normal
- is the point).

Dropped "(experimental)" from the dropdown label and the in-app
caption, and the word "experimental" from the validation report - the
substance (new, additive, not yet independently reviewed) stays, just
not that specific label.
</commit_message>
<xml_diff>
--- a/docs/METHODS_AND_VALIDATION_REPORT.docx
+++ b/docs/METHODS_AND_VALIDATION_REPORT.docx
@@ -65,7 +65,7 @@
       <w:pPr>
         <w:spacing w:after="160"/>
       </w:pPr>
-      <w:hyperlink w:history="1" r:id="rIdvrjswrizy7srupx7ifw-s">
+      <w:hyperlink w:history="1" r:id="rIdetg8kyunrcva0a-_3emcb">
         <w:r>
           <w:rPr>
             <w:rStyle w:val="Hyperlink"/>
@@ -914,7 +914,7 @@
         <w:spacing w:after="120" w:before="240"/>
       </w:pPr>
       <w:r>
-        <w:t xml:space="preserve">5.8 Experimental per-pixel anomaly map</w:t>
+        <w:t xml:space="preserve">5.8 Per-pixel anomaly map</w:t>
       </w:r>
     </w:p>
     <w:p>
@@ -938,7 +938,7 @@
         <w:spacing w:after="160"/>
       </w:pPr>
       <w:r>
-        <w:t xml:space="preserve">This feature is labelled "experimental" in the app itself: it is new, additive (it changes no existing number elsewhere in the product), and has not yet been independently reviewed the way the rest of the methodology has. The coverage percentages it reports are approximate, for the same reason every other live map statistic in this app is approximate — Earth Engine’s best-effort tile resolution can vary slightly between queries.</w:t>
+        <w:t xml:space="preserve">This feature is new and additive — it changes no existing number elsewhere in the product — and has not yet been independently reviewed the way the rest of the methodology has. The coverage percentages it reports are approximate, for the same reason every other live map statistic in this app is approximate — Earth Engine’s best-effort tile resolution can vary slightly between queries.</w:t>
       </w:r>
     </w:p>
     <w:p>
@@ -986,7 +986,7 @@
         <w:spacing w:after="80"/>
       </w:pPr>
       <w:r>
-        <w:t xml:space="preserve">Extend the experimental anomaly map (5.8) to the monthly view; it currently exists for the single-day view only.</w:t>
+        <w:t xml:space="preserve">Extend the anomaly map (5.8) to the monthly view; it currently exists for the single-day view only.</w:t>
       </w:r>
     </w:p>
     <w:p>

</xml_diff>

<commit_message>
Widen the anomaly colour scale to +-9 degC, grounded in real data
The earlier +-6 degC range was a guess, not checked against actual
values - it would have clipped the single most significant known
event in the record (18 Feb 2024, the anchor of "2024 as the warmest
year"), which reaches +7.1 to +8.5 degC at the pixel level. Widened to
+-9 with a little headroom.

Also checked and rejected a season-dependent anomaly scale: the
largest anomalies in this sample are a winter event, so narrowing the
scale in winter would clip the most important case even harder. A
season-dependent scale remains a reasonable idea for the raw
temperature map (not implemented), just not for the anomaly map,
which is already normalised to each day's own seasonal baseline.
</commit_message>
<xml_diff>
--- a/docs/METHODS_AND_VALIDATION_REPORT.docx
+++ b/docs/METHODS_AND_VALIDATION_REPORT.docx
@@ -65,7 +65,7 @@
       <w:pPr>
         <w:spacing w:after="160"/>
       </w:pPr>
-      <w:hyperlink w:history="1" r:id="rIdetg8kyunrcva0a-_3emcb">
+      <w:hyperlink w:history="1" r:id="rIdm3lvxnrvlp_-ror5a50_v">
         <w:r>
           <w:rPr>
             <w:rStyle w:val="Hyperlink"/>
@@ -943,6 +943,22 @@
     </w:p>
     <w:p>
       <w:pPr>
+        <w:spacing w:after="160"/>
+      </w:pPr>
+      <w:r>
+        <w:t xml:space="preserve">The colour scale’s range was checked against real per-pixel anomaly values across several seasons and streams rather than chosen arbitrarily. Most days stay within roughly ±5°C, but the single most significant known event in the record (18 February 2024, the anchor of “2024 as the warmest year”) reaches +7.1°C (Terra morning, 99th percentile) and +8.5°C (Aqua pre-dawn, 99th percentile) at the pixel level — wider than the lake-wide average figure quoted elsewhere, since an individual pixel can run more extreme than the whole-lake mean. The scale is fixed at ±9°C, with a little headroom beyond the largest value observed so far, so this specific event — arguably the one most worth looking at closely — is not clipped.</w:t>
+      </w:r>
+    </w:p>
+    <w:p>
+      <w:pPr>
+        <w:spacing w:after="160"/>
+      </w:pPr>
+      <w:r>
+        <w:t xml:space="preserve">A fixed but season-dependent colour scale (narrower in winter, wider in summer) was considered, following the supervisor’s comment about the raw-temperature map, but checked and rejected for the anomaly map specifically: the largest anomalies in this sample are a winter event, so narrowing the scale for winter would clip the most important case even harder. A season-dependent scale is a reasonable idea for the raw-temperature map — a single fixed −5…32°C range does look washed out within any one season — but does not transfer to the anomaly map, which is already normalised to each day’s own seasonal baseline by construction; the same anomaly magnitude should look the same regardless of the time of year it occurred.</w:t>
+      </w:r>
+    </w:p>
+    <w:p>
+      <w:pPr>
         <w:pStyle w:val="Heading1"/>
         <w:spacing w:after="160" w:before="320"/>
       </w:pPr>
@@ -987,6 +1003,19 @@
       </w:pPr>
       <w:r>
         <w:t xml:space="preserve">Extend the anomaly map (5.8) to the monthly view; it currently exists for the single-day view only.</w:t>
+      </w:r>
+    </w:p>
+    <w:p>
+      <w:pPr>
+        <w:pStyle w:val="ListParagraph"/>
+        <w:numPr>
+          <w:ilvl w:val="0"/>
+          <w:numId w:val="1"/>
+        </w:numPr>
+        <w:spacing w:after="80"/>
+      </w:pPr>
+      <w:r>
+        <w:t xml:space="preserve">A season-dependent colour scale for the raw-temperature map (not the anomaly map — see 5.8), so a single day or month is not stretched across the full −5…32°C range year-round; not yet implemented.</w:t>
       </w:r>
     </w:p>
     <w:p>

</xml_diff>

<commit_message>
Update methods report and user guide for the one-pixel inward lake outline
Documents the 926.6 m shoreline treatment, the refreshed C3 comparison
on that geometry, and the retirement of check C5b.
</commit_message>
<xml_diff>
--- a/docs/METHODS_AND_VALIDATION_REPORT.docx
+++ b/docs/METHODS_AND_VALIDATION_REPORT.docx
@@ -65,7 +65,7 @@
       <w:pPr>
         <w:spacing w:after="160"/>
       </w:pPr>
-      <w:hyperlink w:history="1" r:id="rIdvi28mpcxfav1sqhq6akrq">
+      <w:hyperlink w:history="1" r:id="rId6jelcswjmyv1a9fugylay">
         <w:r>
           <w:rPr>
             <w:rStyle w:val="Hyperlink"/>
@@ -258,7 +258,15 @@
         <w:spacing w:after="160"/>
       </w:pPr>
       <w:r>
-        <w:t xml:space="preserve">The analysis uses the full lake polygon (WISE waterbody HUAIH049) with no inward shoreline erosion (0 m buffer). This was tested against three alternative erosion distances (463 m, 500 m, 927 m); all three further reduce the already-thin nighttime coverage, and Balaton is narrow enough that aggressive erosion removes whole cross-sections of open water. Because this is an anomaly product, the same near-shore mixed pixels sit in both the historical baseline and the current reading, so most of the land-mixing bias cancels in the anomaly rather than skewing it. Basin-level (sub-lake) results are out of scope for the current version.</w:t>
+        <w:t xml:space="preserve">The analysis uses the lake polygon (WISE waterbody HUAIH049) moved inward by one MODIS pixel, 926.6 m, so the mixed land-and-water edge pixels are excluded from every lake average, the colour scale and the coverage figures. This was adopted on 4 October 2026 as decision SPACE-002, following the supervisor’s request for a shoreline shrink of about one pixel and the same treatment used by the HUN-REN Lake Balaton application. It removes about 32% of the lake’s surface area (593 km² to 406 km²).</w:t>
+      </w:r>
+    </w:p>
+    <w:p>
+      <w:pPr>
+        <w:spacing w:after="160"/>
+      </w:pPr>
+      <w:r>
+        <w:t xml:space="preserve">The choice was checked before adoption. On 30 August 2026, removing the edge changed the raw lake-average temperature by −0.4 °C (Terra morning) and −0.7 °C (Aqua afternoon), because the shoreline is warm; this is the effect the supervisor flagged. Across a 112-pair sample of 2023–2026 dates, the per-pixel anomaly (the quantity the product reports) shifted by +0.06 °C on average and was mixed in sign, so the anomaly is largely unaffected by the edge. The change is therefore mainly a cleaner raw-temperature and colour-scale figure, and a small reduction in clear-sky readings (about 30% fewer pixels per day; night-time readings are the most affected). Basin-level (sub-lake) results are out of scope for the current version.</w:t>
       </w:r>
     </w:p>
     <w:p>
@@ -292,7 +300,7 @@
         <w:spacing w:after="160"/>
       </w:pPr>
       <w:r>
-        <w:t xml:space="preserve">No in-situ (thermometer-in-the-water) measurement exists for Lake Balaton, so the product was checked seven independent ways. All seven passed.</w:t>
+        <w:t xml:space="preserve">No in-situ (thermometer-in-the-water) measurement exists for Lake Balaton, so the product was checked several independent ways. All checks pass on the current geometry (the 926.6 m inward shoreline, Section 3.5). One check from the original plan (C5b, the shoreline and strict-QC comparison) was retired on 4 October 2026, once the shoreline rule had been decided.</w:t>
       </w:r>
     </w:p>
     <w:tbl>
@@ -510,7 +518,7 @@
                 <w:sz w:val="20"/>
                 <w:szCs w:val="20"/>
               </w:rPr>
-              <w:t xml:space="preserve">Monthly averages vs. Landsat (different sensor), 258 months, 2003–2024: bias −0.53°C, r = 0.985. ERA5-Land reanalysis tracked as a second independent line. (ESA CCI Lakes / Copernicus LWST are not available in Earth Engine; Landsat + ERA5-Land were substituted, user-approved.)</w:t>
+              <w:t xml:space="preserve">Monthly averages vs. Landsat (different sensor), 2003–2024 (258 months), on the 926.6 m geometry: bias −0.69°C, RMSE 1.95°C, r = 0.984. ERA5-Land reanalysis as a second independent line: bias −0.44°C, RMSE 1.86°C. (The 0 m geometry gave bias −0.53°C, r = 0.985.) (ESA CCI Lakes / Copernicus LWST are not available in Earth Engine; Landsat + ERA5-Land were substituted, user-approved.)</w:t>
             </w:r>
           </w:p>
         </w:tc>
@@ -660,7 +668,7 @@
                 <w:sz w:val="20"/>
                 <w:szCs w:val="20"/>
               </w:rPr>
-              <w:t xml:space="preserve">No systematic anomaly bias found from using the strict (all-zero) QC tier or a 463 m shoreline buffer instead of the chosen rule.</w:t>
+              <w:t xml:space="preserve">Retired 4 October 2026 (the shoreline rule is now decided, and the QC rule is already approved). Earlier result, on the 0 m geometry: no systematic anomaly bias from the strict QC tier or from a 463 m shoreline buffer.</w:t>
             </w:r>
           </w:p>
         </w:tc>

</xml_diff>

<commit_message>
Switch the headline anomaly to per-pixel-first averaging (METH-007)
Each clear pixel is compared with its own 2003-2022 normal for the
same calendar day, then averaged over the lake, instead of comparing
the lake-wide mean of clear pixels with a lake-wide historical
baseline -- the supervisor's 'Partial cloud cover' point. Labels are
ranked against a leave-one-year-out history, computed the same way,
so no year judges itself.

App updated to match the new record schema (the separate 'mean'
reference variant is retired; the daily/monthly charts' reference
line is now reconstructed from the measured value and its anomaly,
documented as such). Report and user guide updated: method section
rewritten, the open question in the limitations section marked
resolved with the measured effect size, future work updated.
</commit_message>
<xml_diff>
--- a/docs/METHODS_AND_VALIDATION_REPORT.docx
+++ b/docs/METHODS_AND_VALIDATION_REPORT.docx
@@ -65,7 +65,7 @@
       <w:pPr>
         <w:spacing w:after="160"/>
       </w:pPr>
-      <w:hyperlink w:history="1" r:id="rId6jelcswjmyv1a9fugylay">
+      <w:hyperlink w:history="1" r:id="rId49o3kiice6vqprjyyuhq_">
         <w:r>
           <w:rPr>
             <w:rStyle w:val="Hyperlink"/>
@@ -208,23 +208,23 @@
         <w:spacing w:after="120" w:before="240"/>
       </w:pPr>
       <w:r>
-        <w:t xml:space="preserve">3.3 Anomaly, percentile and classification</w:t>
-      </w:r>
-    </w:p>
-    <w:p>
-      <w:pPr>
-        <w:spacing w:after="160"/>
-      </w:pPr>
-      <w:r>
-        <w:t xml:space="preserve">For each reading, the anomaly is the measured temperature minus the historical reference for the same ±5-day window. The median of the historical sample is the primary reference (the plain mean is also reported as a secondary figure, since Balaton’s nighttime readings are measurably skewed — the median sits up to 2.6°C above the mean on roughly 60% of the year, and leading with the mean would read nighttime anomalies systematically too warm for statistical reasons alone, not real warming).</w:t>
-      </w:r>
-    </w:p>
-    <w:p>
-      <w:pPr>
-        <w:spacing w:after="160"/>
-      </w:pPr>
-      <w:r>
-        <w:t xml:space="preserve">The reading is also ranked against the full historical sample using the Type-7 percentile estimator, and converted to exactly one of five plain-language labels: below normal (&lt;10th percentile), within normal range (10th–90th), warm (90th–95th), unusually warm (95th–99th), extreme warm observation (&gt;99th). The percentile is always shown alongside the label, since validation (Section 4) found some readings sit close enough to a band boundary that a small, legitimate change in method can flip the label by one notch.</w:t>
+        <w:t xml:space="preserve">3.3 Anomaly, percentile and classification (METH-007, per-pixel-first)</w:t>
+      </w:r>
+    </w:p>
+    <w:p>
+      <w:pPr>
+        <w:spacing w:after="160"/>
+      </w:pPr>
+      <w:r>
+        <w:t xml:space="preserve">As of 8 October 2026, the anomaly is computed per pixel first, then averaged over the lake — not a single lake-wide reading compared with a single lake-wide normal. For each clear pixel, that pixel’s own 2003–2022 median for the same ±5-day window is subtracted from today’s reading at that pixel; the resulting per-pixel differences are then averaged over every clear pixel in the lake. This replaces the earlier method (lake-wide mean minus a lake-wide historical median), which depended on which part of the lake happened to be cloud-free on a partly cloudy day — see Section 5.4 for the supervisor’s point and the evidence behind the change. Each pixel’s reference is a median, not a mean, for the same reason as before: Balaton’s nighttime readings are measurably skewed, and a mean would read nighttime anomalies as systematically too warm for statistical reasons alone.</w:t>
+      </w:r>
+    </w:p>
+    <w:p>
+      <w:pPr>
+        <w:spacing w:after="160"/>
+      </w:pPr>
+      <w:r>
+        <w:t xml:space="preserve">The reading is also ranked against the historical record of daily lake-wide anomalies, computed the same pixel-first way, using the Type-7 percentile estimator, and converted to exactly one of five plain-language labels: below normal (&lt;10th percentile), within normal range (10th–90th), warm (90th–95th), unusually warm (95th–99th), extreme warm observation (&gt;99th). Each historical year is ranked against a reference built from the other 19 years only (leave-one-year-out), so no year partly judges itself. The percentile is always shown alongside the label, since validation (Section 4) found some readings sit close enough to a band boundary that a small, legitimate change in method can flip the label by one notch.</w:t>
       </w:r>
     </w:p>
     <w:p>
@@ -823,15 +823,15 @@
         <w:spacing w:after="120" w:before="240"/>
       </w:pPr>
       <w:r>
-        <w:t xml:space="preserve">5.4 Pixel-mean vs. lake-mean anomaly computation</w:t>
-      </w:r>
-    </w:p>
-    <w:p>
-      <w:pPr>
-        <w:spacing w:after="160"/>
-      </w:pPr>
-      <w:r>
-        <w:t xml:space="preserve">The headline daily/monthly figures still compute the lake-wide mean temperature for a pass first, then compare that single number to the lake-wide historical baseline — this has not changed. An alternative, pixel-first approach — compute each pixel’s own anomaly against its own historical baseline, then average the anomalies — would be more robust to which part of the lake happens to be cloud-free on a partly-cloudy day, since the current approach’s result can depend on which basin is visible. The per-pixel historical baseline this would require has now been built, for the map view only (Section 5.8); using it to also replace the lake-wide scalar computation itself is a separate, not-yet-made decision, recorded here as an open methodological question.</w:t>
+        <w:t xml:space="preserve">5.4 Pixel-mean vs. lake-mean anomaly computation — resolved (METH-007, 8 October 2026)</w:t>
+      </w:r>
+    </w:p>
+    <w:p>
+      <w:pPr>
+        <w:spacing w:after="160"/>
+      </w:pPr>
+      <w:r>
+        <w:t xml:space="preserve">This was an open question as of the previous revision of this report: the headline figures computed the lake-wide mean temperature for a pass first, then compared that single number to a lake-wide historical baseline, which depends on which part of the lake happens to be cloud-free on a partly-cloudy day (the supervisor’s “Partial cloud cover” point). It is now resolved: the headline anomaly is computed per pixel first, then averaged (Section 3.3). A sample check across 108 date-stream pairs, before adoption, found the daytime passes’ old headline ran about 0.9°C warmer than the pixel-first version on most dates, consistently in one direction; night passes were close on average but noisier day to day on a small sample. This confirmed the change was worth making, not just theoretically preferable.</w:t>
       </w:r>
     </w:p>
     <w:p>
@@ -1005,7 +1005,7 @@
         <w:spacing w:after="80"/>
       </w:pPr>
       <w:r>
-        <w:t xml:space="preserve">Decide whether to extend the pixel-first approach (Section 5.8) from the map view into the headline lake-wide anomaly computation itself, as described in 5.4.</w:t>
+        <w:t xml:space="preserve">Extend the per-pixel-first approach (now the headline method, Section 3.3) to basin-level summaries, once a basin geometry exists — the supervisor’s point applies there too.</w:t>
       </w:r>
     </w:p>
     <w:p>

</xml_diff>

<commit_message>
Document the automation, the two grid/sliver bugs, and MODIS end-of-life
Methods report was stale on several points added after its last
update: still said 'manual monthly refresh', didn't mention the
grid-mismatch or sliver-pixel bugs caught before releasing METH-007,
didn't describe the month-completeness display rule, and the VIIRS
future-work bullet didn't mention the scheduled job's own self-disable
safeguard. THE_BALATON_METHOD.html (local only, not pushed) updated
the same way.
</commit_message>
<xml_diff>
--- a/docs/METHODS_AND_VALIDATION_REPORT.docx
+++ b/docs/METHODS_AND_VALIDATION_REPORT.docx
@@ -65,7 +65,7 @@
       <w:pPr>
         <w:spacing w:after="160"/>
       </w:pPr>
-      <w:hyperlink w:history="1" r:id="rId49o3kiice6vqprjyyuhq_">
+      <w:hyperlink w:history="1" r:id="rIdjo6a75cus5g4rte_7mtc6">
         <w:r>
           <w:rPr>
             <w:rStyle w:val="Hyperlink"/>
@@ -229,6 +229,14 @@
     </w:p>
     <w:p>
       <w:pPr>
+        <w:spacing w:after="160"/>
+      </w:pPr>
+      <w:r>
+        <w:t xml:space="preserve">Two real implementation bugs were caught and fixed before this method was published. First, the per-pixel “normal” maps were initially saved on a general-purpose 1 km grid rather than MODIS’s own exact pixel grid; combining a live image with a normal saved on a different grid forced Earth Engine to silently interpolate between them, caught by checking the raw temperature this method produced against the already-validated figure from the previous method (off by up to 0.24°C before the fix; within 0.005°C, a rounding difference, after rebuilding all 1,460 normal maps on MODIS’s own grid). Second, a day where only a sliver of a single shoreline pixel was actually visible could still produce a technically real anomaly value captioned “0% of the lake” — fixed by applying the same “if the rounded pixel count is 0, do not report this day” rule the pre-METH-007 method already used, to both the live reading and the historical comparison pool (147 and 762 rows respectively excluded from the published data as a result).</w:t>
+      </w:r>
+    </w:p>
+    <w:p>
+      <w:pPr>
         <w:pStyle w:val="Heading2"/>
         <w:spacing w:after="120" w:before="240"/>
       </w:pPr>
@@ -284,6 +292,14 @@
       </w:pPr>
       <w:r>
         <w:t xml:space="preserve">A monthly summary is computed per stream, only from days that passed quality control at confidence “low” or better, and only when at least 3 such days exist in that month; otherwise the month is reported as having insufficient valid observations, with the day count still shown. The monthly map (a pixel-by-pixel view of that month) corrects for “clear-sky bias” — the naive approach of averaging each pixel only over the days it was clear runs systematically warm, because clear days are disproportionately the warmer ones. Each day’s pixel values are first expressed as an offset from that day’s own lake-wide average, those offsets are composited, and the correct day-weighted monthly mean is added back — verified to match the reported monthly figure to within about 0.05°C.</w:t>
+      </w:r>
+    </w:p>
+    <w:p>
+      <w:pPr>
+        <w:spacing w:after="160"/>
+      </w:pPr>
+      <w:r>
+        <w:t xml:space="preserve">A month is only ever offered as a whole-month summary — and, as of 9 October 2026, only ever shown in the single-day view either — once the data actually reaches that month’s own last calendar day, not merely once the monthly refresh has run. A month only a few days in (e.g. 1–2 days of a new month, landed a few days ahead of the rest of it) is held back entirely rather than shown and then silently changed again once the remainder arrives; a month already reaching its own last day is not trimmed back further just because a refresh also picked up a day or two of the next one.</w:t>
       </w:r>
     </w:p>
     <w:p>
@@ -887,7 +903,7 @@
         <w:spacing w:after="80"/>
       </w:pPr>
       <w:r>
-        <w:t xml:space="preserve">The monitoring record is extended by a manual monthly refresh, not a live/automatic process; the app shows data only up to the last refresh date.</w:t>
+        <w:t xml:space="preserve">As of 9 October 2026 the monitoring record is extended automatically, once a month (the 7th, chosen to allow a buffer for MODIS processing latency), by a scheduled job rather than a manual step; the app shows data only up to the last completed month (see Section 3.6 for how “complete” is decided). If MODIS stops producing new data for good (Section 6), the job notices after about four months of nothing new and disables its own schedule rather than running indefinitely.</w:t>
       </w:r>
     </w:p>
     <w:p>
@@ -1057,7 +1073,7 @@
         <w:spacing w:after="80"/>
       </w:pPr>
       <w:r>
-        <w:t xml:space="preserve">VIIRS continuity: Terra and Aqua MODIS are approaching end of mission (NASA science operations are expected to conclude for Terra and Aqua within the next couple of years). VIIRS land-surface-temperature data is available in Earth Engine and overlaps with MODIS from 2012 onward, which would allow a cross-calibrated transition to keep this monitoring record alive beyond the MODIS mission. Not yet implemented; a documented path forward rather than a current capability.</w:t>
+        <w:t xml:space="preserve">VIIRS continuity: Terra and Aqua MODIS are approaching end of mission (NASA expects science operations to end for Terra in early 2027 and Aqua in autumn 2027). VIIRS land-surface-temperature data is available in Earth Engine and overlaps with MODIS from 2012 onward, which would allow a cross-calibrated transition to keep this monitoring record alive beyond the MODIS mission. Not yet implemented; a documented path forward rather than a current capability, per the supervisor’s own framing (a description is enough; a prototype would be a bonus). The automatic monthly refresh (Section 5.7) already disables itself if MODIS genuinely stops producing data, so the end of the mission would not pass unnoticed even without this extension.</w:t>
       </w:r>
     </w:p>
     <w:p>
@@ -1289,6 +1305,21 @@
   <w:style w:type="paragraph" w:styleId="Normal" w:default="1">
     <w:name w:val="Normal"/>
     <w:qFormat/>
+  </w:style>
+  <w:style w:type="table" w:styleId="TableNormal" w:default="true">
+    <w:name w:val="Normal Table"/>
+    <w:uiPriority w:val="99"/>
+    <w:semiHidden/>
+    <w:unhideWhenUsed/>
+    <w:tblPr>
+      <w:tblInd w:type="dxa" w:w="0"/>
+      <w:tblCellMar>
+        <w:top w:type="dxa" w:w="0"/>
+        <w:left w:type="dxa" w:w="108"/>
+        <w:bottom w:type="dxa" w:w="0"/>
+        <w:right w:type="dxa" w:w="108"/>
+      </w:tblCellMar>
+    </w:tblPr>
   </w:style>
   <w:style w:type="paragraph" w:styleId="Title">
     <w:name w:val="Title"/>

</xml_diff>